<commit_message>
Polish portfolio contrast and resume files
</commit_message>
<xml_diff>
--- a/resumes/Mikhail_Fedrunov_HR_EN.docx
+++ b/resumes/Mikhail_Fedrunov_HR_EN.docx
@@ -131,7 +131,7 @@
             <w:r>
               <w:drawing>
                 <wp:inline xmlns:a="http://schemas.openxmlformats.org/drawingml/2006/main" xmlns:pic="http://schemas.openxmlformats.org/drawingml/2006/picture">
-                  <wp:extent cx="810000" cy="1026000"/>
+                  <wp:extent cx="871200" cy="1306800"/>
                   <wp:docPr id="1" name="Picture 1"/>
                   <wp:cNvGraphicFramePr>
                     <a:graphicFrameLocks noChangeAspect="1"/>
@@ -140,7 +140,7 @@
                     <a:graphicData uri="http://schemas.openxmlformats.org/drawingml/2006/picture">
                       <pic:pic>
                         <pic:nvPicPr>
-                          <pic:cNvPr id="0" name="mikhail-fedrunov.jpg"/>
+                          <pic:cNvPr id="0" name="mikhail-fedrunov-resume.png"/>
                           <pic:cNvPicPr/>
                         </pic:nvPicPr>
                         <pic:blipFill>
@@ -152,7 +152,7 @@
                         <pic:spPr>
                           <a:xfrm>
                             <a:off x="0" y="0"/>
-                            <a:ext cx="810000" cy="1026000"/>
+                            <a:ext cx="871200" cy="1306800"/>
                           </a:xfrm>
                           <a:prstGeom prst="rect"/>
                         </pic:spPr>
@@ -294,7 +294,7 @@
           <w:color w:val="171717"/>
           <w:sz w:val="19"/>
         </w:rPr>
-        <w:t>1C developer and business analyst with hands-on experience automating trade, manufacturing, warehouse, logistics, product marking and document workflows. I independently cover the full delivery cycle: clarify the request, analyse the process, design, develop, test, deploy and support.</w:t>
+        <w:t>1C developer and business analyst automating trade, manufacturing, warehouse, logistics, product marking and document workflows. I gather requirements, design and develop solutions, validate them in a test environment, deploy to production and provide post-release support.</w:t>
       </w:r>
     </w:p>
     <w:p>
@@ -302,7 +302,7 @@
         <w:pStyle w:val="Heading2"/>
       </w:pPr>
       <w:r>
-        <w:t>What an employer gets</w:t>
+        <w:t>Core qualifications</w:t>
       </w:r>
     </w:p>
     <w:p>
@@ -316,7 +316,7 @@
           <w:color w:val="171717"/>
           <w:sz w:val="18"/>
         </w:rPr>
-        <w:t>One specialist covering 1C development, business analysis and integrations.</w:t>
+        <w:t>1C development: extensions, external processors, reports, documents, registers and print forms.</w:t>
       </w:r>
     </w:p>
     <w:p>
@@ -330,7 +330,7 @@
           <w:color w:val="171717"/>
           <w:sz w:val="18"/>
         </w:rPr>
-        <w:t>Solutions designed around the real user workflow, not only a formal specification.</w:t>
+        <w:t>Integrations via HTTP/True API, FTP, JSON and XML; background and scheduled jobs.</w:t>
       </w:r>
     </w:p>
     <w:p>
@@ -344,7 +344,7 @@
           <w:color w:val="171717"/>
           <w:sz w:val="18"/>
         </w:rPr>
-        <w:t>Production tools supported and improved after launch.</w:t>
+        <w:t>Requirements gathering and process analysis with accounting, sales, logistics, warehouse and management teams.</w:t>
       </w:r>
     </w:p>
     <w:p>
@@ -358,7 +358,7 @@
           <w:color w:val="171717"/>
           <w:sz w:val="18"/>
         </w:rPr>
-        <w:t>First-hand warehouse and logistics experience that accelerates process discovery.</w:t>
+        <w:t>Practical knowledge of warehouse accounting, goods movement, source documents and cross-database exchanges.</w:t>
       </w:r>
     </w:p>
     <w:p>
@@ -985,7 +985,7 @@
           <w:color w:val="171717"/>
           <w:sz w:val="19"/>
         </w:rPr>
-        <w:t>These are representative case studies, not a complete task list. Unusual requests from managers and users were independently clarified, formalised and delivered as working solutions.</w:t>
+        <w:t>The projects below represent part of the delivered work. I also handled ongoing improvements requested by managers and users, clarified requirements independently and remained responsible for the result after deployment.</w:t>
       </w:r>
     </w:p>
     <w:p>

</xml_diff>